<commit_message>
MediBec: S2 and S8 scored AV:L; reference totals 84,305 / 41,023
The representative weakness of S2 (ransomware) and S8 (detection gap) is a
malicious e-mailed document opened locally, which the FIRST CVSS v4.0 user
guide scores as Local: S2 9.4 -> 9.3, S8 9.3 -> 9.2. Recomputed with
crg_calc: total estimated 84,305 and residual 41,023 (was 84,491 / 41,104);
no verdict changes (12 above, 11 approximately at, 7 below).

- data.py writes data.json; data30.json, medibec30.json and budget.json
  regenerated from the sources
- retired markers replaced with Analytical estimate / Information gap in
  every builder; 'CyberRiskGuardian KRIs' headers renamed risk indices
- all seven deliverables rebuilt (openpyxl, docx-js), workbooks
  recalculated with LibreOffice: 0 formula errors, totals equal crg_calc

Co-Authored-By: Claude Opus 5.5 <noreply@anthropic.com>
Claude-Session: https://claude.ai/code/session_01A2TtsRJov8uxPoHCkXTh3x
</commit_message>
<xml_diff>
--- a/examples/medibec/deliverables/MediBec_Cybersecurity_Risk_Assessment.docx
+++ b/examples/medibec/deliverables/MediBec_Cybersecurity_Risk_Assessment.docx
@@ -218,7 +218,7 @@
                 <w:sz w:val="19"/>
                 <w:szCs w:val="19"/>
               </w:rPr>
-              <w:t xml:space="preserve"> Based solely on the MediBec Business Case v2.0b, a fictional teaching case. All probabilities, damages, CVSS vectors, costs and effectiveness values are </w:t>
+              <w:t xml:space="preserve"> Based solely on the MediBec Business Case v2.0b, a fictional teaching case. All probabilities, damages, CVSS vectors, costs and effectiveness values are analytical estimates (</w:t>
             </w:r>
             <w:r>
               <w:rPr>
@@ -228,7 +228,7 @@
                 <w:sz w:val="19"/>
                 <w:szCs w:val="19"/>
               </w:rPr>
-              <w:t xml:space="preserve">analyst estimates - validation required</w:t>
+              <w:t xml:space="preserve">Analytical estimate — validation required</w:t>
             </w:r>
             <w:r>
               <w:rPr>
@@ -236,7 +236,7 @@
                 <w:sz w:val="19"/>
                 <w:szCs w:val="19"/>
               </w:rPr>
-              <w:t xml:space="preserve">. Scores are relative decision-support indicators, not predictions of incidents or dollar losses. Risk acceptance decisions remain with MediBec management.</w:t>
+              <w:t xml:space="preserve">). Scores are relative decision-support indicators, not predictions of incidents or dollar losses. Risk acceptance decisions remain with MediBec management.</w:t>
             </w:r>
           </w:p>
         </w:tc>
@@ -452,7 +452,7 @@
         <w:rPr>
           <w:rFonts w:ascii="Arial" w:cs="Arial" w:eastAsia="Arial" w:hAnsi="Arial"/>
         </w:rPr>
-        <w:t xml:space="preserve"> (50,492 to 22,804 risk units). Indicative cost: </w:t>
+        <w:t xml:space="preserve"> (50,306 to 22,722 risk units). Indicative cost: </w:t>
       </w:r>
       <w:r>
         <w:rPr>
@@ -743,7 +743,7 @@
                 <w:sz w:val="16"/>
                 <w:szCs w:val="16"/>
               </w:rPr>
-              <w:t xml:space="preserve">9,486</w:t>
+              <w:t xml:space="preserve">9,384</w:t>
             </w:r>
           </w:p>
         </w:tc>
@@ -764,7 +764,7 @@
                 <w:sz w:val="16"/>
                 <w:szCs w:val="16"/>
               </w:rPr>
-              <w:t xml:space="preserve">4,174</w:t>
+              <w:t xml:space="preserve">4,129</w:t>
             </w:r>
           </w:p>
         </w:tc>
@@ -872,7 +872,7 @@
                 <w:sz w:val="16"/>
                 <w:szCs w:val="16"/>
               </w:rPr>
-              <w:t xml:space="preserve">7,893</w:t>
+              <w:t xml:space="preserve">7,810</w:t>
             </w:r>
           </w:p>
         </w:tc>
@@ -893,7 +893,7 @@
                 <w:sz w:val="16"/>
                 <w:szCs w:val="16"/>
               </w:rPr>
-              <w:t xml:space="preserve">3,453</w:t>
+              <w:t xml:space="preserve">3,417</w:t>
             </w:r>
           </w:p>
         </w:tc>
@@ -1497,7 +1497,7 @@
         <w:rPr>
           <w:rFonts w:ascii="Arial" w:cs="Arial" w:eastAsia="Arial" w:hAnsi="Arial"/>
         </w:rPr>
-        <w:t xml:space="preserve"> - Confirm the cybersecurity risk appetite (analyst estimate 0.30 vs. 0.40 stated in the case). At 0.40, only S9 remains above tolerance and S7 sits at the upper edge.</w:t>
+        <w:t xml:space="preserve"> - Confirm the cybersecurity risk appetite (analytical estimate 0.30 vs. 0.40 stated in the case). At 0.40, only S9 remains above tolerance and S7 sits at the upper edge.</w:t>
       </w:r>
     </w:p>
     <w:p>
@@ -3381,7 +3381,7 @@
                 <w:sz w:val="15"/>
                 <w:szCs w:val="15"/>
               </w:rPr>
-              <w:t xml:space="preserve">Authoritative KRI formulas; CVSS v4.0; multiplication factor 1,000 in worked example; reductions must stay within 0-1.</w:t>
+              <w:t xml:space="preserve">Authoritative risk-index formulas; CVSS v4.0; multiplication factor 1,000 in worked example; reductions must stay within 0-1.</w:t>
             </w:r>
           </w:p>
         </w:tc>
@@ -3626,7 +3626,7 @@
           <w:b/>
           <w:bCs/>
         </w:rPr>
-        <w:t xml:space="preserve">Analyst estimate - validation required</w:t>
+        <w:t xml:space="preserve">Analytical estimate — validation required</w:t>
       </w:r>
       <w:r>
         <w:rPr>
@@ -3640,7 +3640,7 @@
           <w:b/>
           <w:bCs/>
         </w:rPr>
-        <w:t xml:space="preserve">Evidence gap - organizational input required</w:t>
+        <w:t xml:space="preserve">Information gap — organizational validation required</w:t>
       </w:r>
       <w:r>
         <w:rPr>
@@ -4171,7 +4171,7 @@
                 <w:sz w:val="16"/>
                 <w:szCs w:val="16"/>
               </w:rPr>
-              <w:t xml:space="preserve">Evidence gap</w:t>
+              <w:t xml:space="preserve">Information gap — organizational validation required</w:t>
             </w:r>
             <w:r>
               <w:rPr>
@@ -6176,7 +6176,7 @@
           <w:b/>
           <w:bCs/>
         </w:rPr>
-        <w:t xml:space="preserve">Evidence gap - organizational input required</w:t>
+        <w:t xml:space="preserve">Information gap — organizational validation required</w:t>
       </w:r>
       <w:r>
         <w:rPr>
@@ -6241,7 +6241,7 @@
                 <w:sz w:val="19"/>
                 <w:szCs w:val="19"/>
               </w:rPr>
-              <w:t xml:space="preserve"> (risk averse). Analyst estimate - validation required.</w:t>
+              <w:t xml:space="preserve"> (risk averse). Analytical estimate — validation required.</w:t>
             </w:r>
           </w:p>
         </w:tc>
@@ -12138,7 +12138,7 @@
                 <w:sz w:val="14"/>
                 <w:szCs w:val="14"/>
               </w:rPr>
-              <w:t xml:space="preserve">9.4</w:t>
+              <w:t xml:space="preserve">9.3</w:t>
             </w:r>
           </w:p>
         </w:tc>
@@ -12159,7 +12159,7 @@
                 <w:sz w:val="14"/>
                 <w:szCs w:val="14"/>
               </w:rPr>
-              <w:t xml:space="preserve">7,893</w:t>
+              <w:t xml:space="preserve">7,810</w:t>
             </w:r>
           </w:p>
         </w:tc>
@@ -12180,7 +12180,7 @@
                 <w:sz w:val="14"/>
                 <w:szCs w:val="14"/>
               </w:rPr>
-              <w:t xml:space="preserve">2,870</w:t>
+              <w:t xml:space="preserve">2,840</w:t>
             </w:r>
           </w:p>
         </w:tc>
@@ -12201,7 +12201,7 @@
                 <w:sz w:val="14"/>
                 <w:szCs w:val="14"/>
               </w:rPr>
-              <w:t xml:space="preserve">3,453</w:t>
+              <w:t xml:space="preserve">3,417</w:t>
             </w:r>
           </w:p>
         </w:tc>
@@ -13290,7 +13290,7 @@
                 <w:sz w:val="14"/>
                 <w:szCs w:val="14"/>
               </w:rPr>
-              <w:t xml:space="preserve">9.3</w:t>
+              <w:t xml:space="preserve">9.2</w:t>
             </w:r>
           </w:p>
         </w:tc>
@@ -13311,7 +13311,7 @@
                 <w:sz w:val="14"/>
                 <w:szCs w:val="14"/>
               </w:rPr>
-              <w:t xml:space="preserve">9,486</w:t>
+              <w:t xml:space="preserve">9,384</w:t>
             </w:r>
           </w:p>
         </w:tc>
@@ -13332,7 +13332,7 @@
                 <w:sz w:val="14"/>
                 <w:szCs w:val="14"/>
               </w:rPr>
-              <w:t xml:space="preserve">3,794</w:t>
+              <w:t xml:space="preserve">3,754</w:t>
             </w:r>
           </w:p>
         </w:tc>
@@ -13353,7 +13353,7 @@
                 <w:sz w:val="14"/>
                 <w:szCs w:val="14"/>
               </w:rPr>
-              <w:t xml:space="preserve">4,174</w:t>
+              <w:t xml:space="preserve">4,129</w:t>
             </w:r>
           </w:p>
         </w:tc>
@@ -13820,7 +13820,7 @@
         <w:rPr>
           <w:rFonts w:ascii="Arial" w:cs="Arial" w:eastAsia="Arial" w:hAnsi="Arial"/>
         </w:rPr>
-        <w:t xml:space="preserve">Totals: estimated 50,492, tolerated 20,508, residual 22,804 risk units. Initiative names are listed in Section 10.</w:t>
+        <w:t xml:space="preserve">Totals: estimated 50,306, tolerated 20,437, residual 22,722 risk units. Initiative names are listed in Section 10.</w:t>
       </w:r>
     </w:p>
     <w:p>
@@ -14278,7 +14278,7 @@
                 <w:sz w:val="16"/>
                 <w:szCs w:val="16"/>
               </w:rPr>
-              <w:t xml:space="preserve">Awareness programme maturity unknown (Evidence gap)</w:t>
+              <w:t xml:space="preserve">Awareness programme maturity unknown (Information gap)</w:t>
             </w:r>
           </w:p>
         </w:tc>
@@ -16107,7 +16107,7 @@
           <w:sz w:val="18"/>
           <w:szCs w:val="18"/>
         </w:rPr>
-        <w:t xml:space="preserve">Analyst estimate - validation required.</w:t>
+        <w:t xml:space="preserve">Analytical estimate — validation required.</w:t>
       </w:r>
     </w:p>
     <w:p>
@@ -17184,7 +17184,7 @@
                 <w:sz w:val="16"/>
                 <w:szCs w:val="16"/>
               </w:rPr>
-              <w:t xml:space="preserve">Privileged credential hygiene unknown (Evidence gap)</w:t>
+              <w:t xml:space="preserve">Privileged credential hygiene unknown (Information gap)</w:t>
             </w:r>
           </w:p>
           <w:p>
@@ -19033,7 +19033,7 @@
           <w:sz w:val="18"/>
           <w:szCs w:val="18"/>
         </w:rPr>
-        <w:t xml:space="preserve">Analyst estimate - validation required.</w:t>
+        <w:t xml:space="preserve">Analytical estimate — validation required.</w:t>
       </w:r>
     </w:p>
     <w:p>
@@ -19063,7 +19063,7 @@
         <w:rPr>
           <w:rFonts w:ascii="Arial" w:cs="Arial" w:eastAsia="Arial" w:hAnsi="Arial"/>
         </w:rPr>
-        <w:t xml:space="preserve"> CVSS:4.0/AV:N/AC:L/AT:N/PR:N/UI:P/VC:H/VI:H/VA:H/SC:H/SI:H/SA:H   </w:t>
+        <w:t xml:space="preserve"> CVSS:4.0/AV:L/AC:L/AT:N/PR:N/UI:P/VC:H/VI:H/VA:H/SC:H/SI:H/SA:H   </w:t>
       </w:r>
       <w:r>
         <w:rPr>
@@ -19077,7 +19077,7 @@
         <w:rPr>
           <w:rFonts w:ascii="Arial" w:cs="Arial" w:eastAsia="Arial" w:hAnsi="Arial"/>
         </w:rPr>
-        <w:t xml:space="preserve"> 9.4 (Critical)</w:t>
+        <w:t xml:space="preserve"> 9.3 (Critical)</w:t>
       </w:r>
     </w:p>
     <w:p>
@@ -19088,7 +19088,7 @@
         <w:rPr>
           <w:rFonts w:ascii="Arial" w:cs="Arial" w:eastAsia="Arial" w:hAnsi="Arial"/>
         </w:rPr>
-        <w:t xml:space="preserve">Representative weakness: malicious macro document leading to code execution (initial vector in E6). AV:N delivered by e-mail; AC:L; AT:N; PR:N; UI:P user opens the document; VC/VI/VA:H on the workstation; SC/SI/SA:H because EHR and clinic systems are subsequently affected. CVSS describes the entry weakness only, not the enterprise impact.</w:t>
+        <w:t xml:space="preserve">Representative weakness: malicious macro document leading to code execution (initial vector in E6). AV:L: the document is delivered by e-mail but opened and executed locally on the workstation (FIRST CVSS v4.0 user guide scores malicious documents as Local whatever the delivery channel); AC:L; AT:N; PR:N; UI:P user opens the document; VC/VI/VA:H on the workstation; SC/SI/SA:H because EHR and clinic systems are subsequently affected. CVSS describes the entry weakness only, not the enterprise impact.</w:t>
       </w:r>
     </w:p>
     <w:p>
@@ -19238,7 +19238,7 @@
                 <w:sz w:val="15"/>
                 <w:szCs w:val="15"/>
               </w:rPr>
-              <w:t xml:space="preserve">0.75 x 0.50 x 9.4 x ((0.70 + 0.95) / 2) x 0.95 / 0.35 x 1,000</w:t>
+              <w:t xml:space="preserve">0.75 x 0.50 x 9.3 x ((0.70 + 0.95) / 2) x 0.95 / 0.35 x 1,000</w:t>
             </w:r>
           </w:p>
         </w:tc>
@@ -19259,7 +19259,7 @@
                 <w:sz w:val="15"/>
                 <w:szCs w:val="15"/>
               </w:rPr>
-              <w:t xml:space="preserve">7,893</w:t>
+              <w:t xml:space="preserve">7,810</w:t>
             </w:r>
           </w:p>
         </w:tc>
@@ -19305,7 +19305,7 @@
                 <w:sz w:val="15"/>
                 <w:szCs w:val="15"/>
               </w:rPr>
-              <w:t xml:space="preserve">0.75 x 0.50 x 9.4 x 0.30 x 0.95 / 0.35 x 1,000</w:t>
+              <w:t xml:space="preserve">0.75 x 0.50 x 9.3 x 0.30 x 0.95 / 0.35 x 1,000</w:t>
             </w:r>
           </w:p>
         </w:tc>
@@ -19327,7 +19327,7 @@
                 <w:sz w:val="15"/>
                 <w:szCs w:val="15"/>
               </w:rPr>
-              <w:t xml:space="preserve">2,870</w:t>
+              <w:t xml:space="preserve">2,840</w:t>
             </w:r>
           </w:p>
         </w:tc>
@@ -19371,7 +19371,7 @@
                 <w:sz w:val="15"/>
                 <w:szCs w:val="15"/>
               </w:rPr>
-              <w:t xml:space="preserve">7,893 x 0.75 (probability) x 0.75 (impact)</w:t>
+              <w:t xml:space="preserve">7,810 x 0.75 (probability) x 0.75 (impact)</w:t>
             </w:r>
           </w:p>
         </w:tc>
@@ -19392,7 +19392,7 @@
                 <w:sz w:val="15"/>
                 <w:szCs w:val="15"/>
               </w:rPr>
-              <w:t xml:space="preserve">4,440</w:t>
+              <w:t xml:space="preserve">4,393</w:t>
             </w:r>
           </w:p>
         </w:tc>
@@ -19438,7 +19438,7 @@
                 <w:sz w:val="15"/>
                 <w:szCs w:val="15"/>
               </w:rPr>
-              <w:t xml:space="preserve">7,893 - 4,440</w:t>
+              <w:t xml:space="preserve">7,810 - 4,393</w:t>
             </w:r>
           </w:p>
         </w:tc>
@@ -19460,7 +19460,7 @@
                 <w:sz w:val="15"/>
                 <w:szCs w:val="15"/>
               </w:rPr>
-              <w:t xml:space="preserve">3,453</w:t>
+              <w:t xml:space="preserve">3,417</w:t>
             </w:r>
           </w:p>
         </w:tc>
@@ -19504,7 +19504,7 @@
                 <w:sz w:val="15"/>
                 <w:szCs w:val="15"/>
               </w:rPr>
-              <w:t xml:space="preserve">3,453 / 2,870  (pre-treatment ratio 2.75)</w:t>
+              <w:t xml:space="preserve">3,417 / 2,840  (pre-treatment ratio 2.75)</w:t>
             </w:r>
           </w:p>
         </w:tc>
@@ -19571,7 +19571,7 @@
                 <w:sz w:val="15"/>
                 <w:szCs w:val="15"/>
               </w:rPr>
-              <w:t xml:space="preserve">(7,893 - 3,453) / $585,889 x 1,000</w:t>
+              <w:t xml:space="preserve">(7,810 - 3,417) / $585,889 x 1,000</w:t>
             </w:r>
           </w:p>
         </w:tc>
@@ -19593,7 +19593,7 @@
                 <w:sz w:val="15"/>
                 <w:szCs w:val="15"/>
               </w:rPr>
-              <w:t xml:space="preserve">7.58</w:t>
+              <w:t xml:space="preserve">7.50</w:t>
             </w:r>
           </w:p>
         </w:tc>
@@ -21925,7 +21925,7 @@
           <w:sz w:val="18"/>
           <w:szCs w:val="18"/>
         </w:rPr>
-        <w:t xml:space="preserve">Analyst estimate - validation required.</w:t>
+        <w:t xml:space="preserve">Analytical estimate — validation required.</w:t>
       </w:r>
     </w:p>
     <w:p>
@@ -24785,7 +24785,7 @@
           <w:sz w:val="18"/>
           <w:szCs w:val="18"/>
         </w:rPr>
-        <w:t xml:space="preserve">Analyst estimate - validation required.</w:t>
+        <w:t xml:space="preserve">Analytical estimate — validation required.</w:t>
       </w:r>
     </w:p>
     <w:p>
@@ -27611,7 +27611,7 @@
           <w:sz w:val="18"/>
           <w:szCs w:val="18"/>
         </w:rPr>
-        <w:t xml:space="preserve">Analyst estimate - validation required.</w:t>
+        <w:t xml:space="preserve">Analytical estimate — validation required.</w:t>
       </w:r>
     </w:p>
     <w:p>
@@ -28706,7 +28706,7 @@
                 <w:sz w:val="16"/>
                 <w:szCs w:val="16"/>
               </w:rPr>
-              <w:t xml:space="preserve">Possible end-of-life systems (Evidence gap)</w:t>
+              <w:t xml:space="preserve">Possible end-of-life systems (Information gap)</w:t>
             </w:r>
           </w:p>
         </w:tc>
@@ -30477,7 +30477,7 @@
           <w:sz w:val="18"/>
           <w:szCs w:val="18"/>
         </w:rPr>
-        <w:t xml:space="preserve">Analyst estimate - validation required.</w:t>
+        <w:t xml:space="preserve">Analytical estimate — validation required.</w:t>
       </w:r>
     </w:p>
     <w:p>
@@ -33325,7 +33325,7 @@
           <w:sz w:val="18"/>
           <w:szCs w:val="18"/>
         </w:rPr>
-        <w:t xml:space="preserve">Analyst estimate - validation required.</w:t>
+        <w:t xml:space="preserve">Analytical estimate — validation required.</w:t>
       </w:r>
     </w:p>
     <w:p>
@@ -36211,7 +36211,7 @@
           <w:sz w:val="18"/>
           <w:szCs w:val="18"/>
         </w:rPr>
-        <w:t xml:space="preserve">Analyst estimate - validation required.</w:t>
+        <w:t xml:space="preserve">Analytical estimate — validation required.</w:t>
       </w:r>
     </w:p>
     <w:p>
@@ -36241,7 +36241,7 @@
         <w:rPr>
           <w:rFonts w:ascii="Arial" w:cs="Arial" w:eastAsia="Arial" w:hAnsi="Arial"/>
         </w:rPr>
-        <w:t xml:space="preserve"> CVSS:4.0/AV:N/AC:L/AT:N/PR:N/UI:P/VC:H/VI:H/VA:L/SC:H/SI:L/SA:L   </w:t>
+        <w:t xml:space="preserve"> CVSS:4.0/AV:L/AC:L/AT:N/PR:N/UI:P/VC:H/VI:H/VA:L/SC:H/SI:L/SA:L   </w:t>
       </w:r>
       <w:r>
         <w:rPr>
@@ -36255,7 +36255,7 @@
         <w:rPr>
           <w:rFonts w:ascii="Arial" w:cs="Arial" w:eastAsia="Arial" w:hAnsi="Arial"/>
         </w:rPr>
-        <w:t xml:space="preserve"> 9.3 (Critical)</w:t>
+        <w:t xml:space="preserve"> 9.2 (Critical)</w:t>
       </w:r>
     </w:p>
     <w:p>
@@ -36266,7 +36266,7 @@
         <w:rPr>
           <w:rFonts w:ascii="Arial" w:cs="Arial" w:eastAsia="Arial" w:hAnsi="Arial"/>
         </w:rPr>
-        <w:t xml:space="preserve">Limited applicability: a detection gap is a control weakness, not a vulnerability. Representative weakness for the workbook: the undetected initial code-execution vector (macro/PowerShell, E6). Do not interpret the score as the severity of the detection gap.</w:t>
+        <w:t xml:space="preserve">Limited applicability: a detection gap is a control weakness, not a vulnerability. Representative weakness for the workbook: the undetected initial code-execution vector (macro/PowerShell, E6), scored AV:L because the e-mailed document is opened and executed locally (FIRST CVSS v4.0 user guide). Do not interpret the score as the severity of the detection gap.</w:t>
       </w:r>
     </w:p>
     <w:p>
@@ -36416,7 +36416,7 @@
                 <w:sz w:val="15"/>
                 <w:szCs w:val="15"/>
               </w:rPr>
-              <w:t xml:space="preserve">0.80 x 0.60 x 9.3 x ((0.60 + 0.90) / 2) x 0.85 / 0.30 x 1,000</w:t>
+              <w:t xml:space="preserve">0.80 x 0.60 x 9.2 x ((0.60 + 0.90) / 2) x 0.85 / 0.30 x 1,000</w:t>
             </w:r>
           </w:p>
         </w:tc>
@@ -36437,7 +36437,7 @@
                 <w:sz w:val="15"/>
                 <w:szCs w:val="15"/>
               </w:rPr>
-              <w:t xml:space="preserve">9,486</w:t>
+              <w:t xml:space="preserve">9,384</w:t>
             </w:r>
           </w:p>
         </w:tc>
@@ -36483,7 +36483,7 @@
                 <w:sz w:val="15"/>
                 <w:szCs w:val="15"/>
               </w:rPr>
-              <w:t xml:space="preserve">0.80 x 0.60 x 9.3 x 0.30 x 0.85 / 0.30 x 1,000</w:t>
+              <w:t xml:space="preserve">0.80 x 0.60 x 9.2 x 0.30 x 0.85 / 0.30 x 1,000</w:t>
             </w:r>
           </w:p>
         </w:tc>
@@ -36505,7 +36505,7 @@
                 <w:sz w:val="15"/>
                 <w:szCs w:val="15"/>
               </w:rPr>
-              <w:t xml:space="preserve">3,794</w:t>
+              <w:t xml:space="preserve">3,754</w:t>
             </w:r>
           </w:p>
         </w:tc>
@@ -36549,7 +36549,7 @@
                 <w:sz w:val="15"/>
                 <w:szCs w:val="15"/>
               </w:rPr>
-              <w:t xml:space="preserve">9,486 x 0.70 (probability) x 0.80 (impact)</w:t>
+              <w:t xml:space="preserve">9,384 x 0.70 (probability) x 0.80 (impact)</w:t>
             </w:r>
           </w:p>
         </w:tc>
@@ -36570,7 +36570,7 @@
                 <w:sz w:val="15"/>
                 <w:szCs w:val="15"/>
               </w:rPr>
-              <w:t xml:space="preserve">5,312</w:t>
+              <w:t xml:space="preserve">5,255</w:t>
             </w:r>
           </w:p>
         </w:tc>
@@ -36616,7 +36616,7 @@
                 <w:sz w:val="15"/>
                 <w:szCs w:val="15"/>
               </w:rPr>
-              <w:t xml:space="preserve">9,486 - 5,312</w:t>
+              <w:t xml:space="preserve">9,384 - 5,255</w:t>
             </w:r>
           </w:p>
         </w:tc>
@@ -36638,7 +36638,7 @@
                 <w:sz w:val="15"/>
                 <w:szCs w:val="15"/>
               </w:rPr>
-              <w:t xml:space="preserve">4,174</w:t>
+              <w:t xml:space="preserve">4,129</w:t>
             </w:r>
           </w:p>
         </w:tc>
@@ -36682,7 +36682,7 @@
                 <w:sz w:val="15"/>
                 <w:szCs w:val="15"/>
               </w:rPr>
-              <w:t xml:space="preserve">4,174 / 3,794  (pre-treatment ratio 2.50)</w:t>
+              <w:t xml:space="preserve">4,129 / 3,754  (pre-treatment ratio 2.50)</w:t>
             </w:r>
           </w:p>
         </w:tc>
@@ -36749,7 +36749,7 @@
                 <w:sz w:val="15"/>
                 <w:szCs w:val="15"/>
               </w:rPr>
-              <w:t xml:space="preserve">(9,486 - 4,174) / $208,889 x 1,000</w:t>
+              <w:t xml:space="preserve">(9,384 - 4,129) / $208,889 x 1,000</w:t>
             </w:r>
           </w:p>
         </w:tc>
@@ -36771,7 +36771,7 @@
                 <w:sz w:val="15"/>
                 <w:szCs w:val="15"/>
               </w:rPr>
-              <w:t xml:space="preserve">25.43</w:t>
+              <w:t xml:space="preserve">25.16</w:t>
             </w:r>
           </w:p>
         </w:tc>
@@ -39069,7 +39069,7 @@
           <w:sz w:val="18"/>
           <w:szCs w:val="18"/>
         </w:rPr>
-        <w:t xml:space="preserve">Analyst estimate - validation required.</w:t>
+        <w:t xml:space="preserve">Analytical estimate — validation required.</w:t>
       </w:r>
     </w:p>
     <w:p>
@@ -41913,7 +41913,7 @@
           <w:sz w:val="18"/>
           <w:szCs w:val="18"/>
         </w:rPr>
-        <w:t xml:space="preserve">Analyst estimate - validation required.</w:t>
+        <w:t xml:space="preserve">Analytical estimate — validation required.</w:t>
       </w:r>
     </w:p>
     <w:p>
@@ -43193,7 +43193,7 @@
           <w:b/>
           <w:bCs/>
         </w:rPr>
-        <w:t xml:space="preserve">Evidence gap</w:t>
+        <w:t xml:space="preserve">Information gap — organizational validation required</w:t>
       </w:r>
       <w:r>
         <w:rPr>
@@ -44206,7 +44206,7 @@
                 <w:sz w:val="15"/>
                 <w:szCs w:val="15"/>
               </w:rPr>
-              <w:t xml:space="preserve">1,038 / 0.67</w:t>
+              <w:t xml:space="preserve">1,027 / 0.67</w:t>
             </w:r>
           </w:p>
         </w:tc>
@@ -44227,7 +44227,7 @@
                 <w:sz w:val="15"/>
                 <w:szCs w:val="15"/>
               </w:rPr>
-              <w:t xml:space="preserve">3,453 / 1.20</w:t>
+              <w:t xml:space="preserve">3,417 / 1.20</w:t>
             </w:r>
           </w:p>
         </w:tc>
@@ -44248,7 +44248,7 @@
                 <w:sz w:val="15"/>
                 <w:szCs w:val="15"/>
               </w:rPr>
-              <w:t xml:space="preserve">9,416 / 1.72</w:t>
+              <w:t xml:space="preserve">9,316 / 1.72</w:t>
             </w:r>
           </w:p>
         </w:tc>
@@ -44730,7 +44730,7 @@
                 <w:sz w:val="15"/>
                 <w:szCs w:val="15"/>
               </w:rPr>
-              <w:t xml:space="preserve">1,259 / 0.61</w:t>
+              <w:t xml:space="preserve">1,245 / 0.61</w:t>
             </w:r>
           </w:p>
         </w:tc>
@@ -44751,7 +44751,7 @@
                 <w:sz w:val="15"/>
                 <w:szCs w:val="15"/>
               </w:rPr>
-              <w:t xml:space="preserve">4,174 / 1.10</w:t>
+              <w:t xml:space="preserve">4,129 / 1.10</w:t>
             </w:r>
           </w:p>
         </w:tc>
@@ -44772,7 +44772,7 @@
                 <w:sz w:val="15"/>
                 <w:szCs w:val="15"/>
               </w:rPr>
-              <w:t xml:space="preserve">12,204 / 1.63</w:t>
+              <w:t xml:space="preserve">12,073 / 1.63</w:t>
             </w:r>
           </w:p>
         </w:tc>
@@ -46211,7 +46211,7 @@
           <w:b/>
           <w:bCs/>
         </w:rPr>
-        <w:t xml:space="preserve">indicative analyst estimates in CAD</w:t>
+        <w:t xml:space="preserve">indicative analytical estimates in CAD</w:t>
       </w:r>
       <w:r>
         <w:rPr>
@@ -46267,7 +46267,7 @@
           <w:b/>
           <w:bCs/>
         </w:rPr>
-        <w:t xml:space="preserve">Evidence gap</w:t>
+        <w:t xml:space="preserve">Information gap — organizational validation required</w:t>
       </w:r>
       <w:r>
         <w:rPr>
@@ -49492,7 +49492,7 @@
                 <w:sz w:val="16"/>
                 <w:szCs w:val="16"/>
               </w:rPr>
-              <w:t xml:space="preserve">50,492 -&gt; 22,804 risk units (55%)</w:t>
+              <w:t xml:space="preserve">50,306 -&gt; 22,722 risk units (55%)</w:t>
             </w:r>
           </w:p>
         </w:tc>
@@ -55817,7 +55817,7 @@
                 <w:sz w:val="15"/>
                 <w:szCs w:val="15"/>
               </w:rPr>
-              <w:t xml:space="preserve">Validate estimates and close evidence gaps</w:t>
+              <w:t xml:space="preserve">Validate estimates and close information gaps</w:t>
             </w:r>
           </w:p>
         </w:tc>
@@ -56044,8 +56044,8 @@
       </w:tr>
     </w:tbl>
     <w:sectPr>
-      <w:headerReference w:type="default" r:id="rId7"/>
-      <w:footerReference w:type="default" r:id="rId8"/>
+      <w:headerReference w:type="default" r:id="rId6"/>
+      <w:footerReference w:type="default" r:id="rId7"/>
       <w:pgSz w:w="12240" w:h="15840" w:orient="portrait"/>
       <w:pgMar w:top="1440" w:right="1440" w:bottom="1440" w:left="1440" w:header="708" w:footer="708" w:gutter="0"/>
       <w:pgNumType/>
@@ -56053,10 +56053,6 @@
     </w:sectPr>
   </w:body>
 </w:document>
-</file>
-
-<file path=word/comments.xml><?xml version="1.0" encoding="utf-8"?>
-<w:comments xmlns:cx="http://schemas.microsoft.com/office/drawing/2014/chartex" xmlns:cx1="http://schemas.microsoft.com/office/drawing/2015/9/8/chartex" xmlns:cx2="http://schemas.microsoft.com/office/drawing/2015/10/21/chartex" xmlns:cx3="http://schemas.microsoft.com/office/drawing/2016/5/9/chartex" xmlns:cx4="http://schemas.microsoft.com/office/drawing/2016/5/10/chartex" xmlns:cx5="http://schemas.microsoft.com/office/drawing/2016/5/11/chartex" xmlns:cx6="http://schemas.microsoft.com/office/drawing/2016/5/12/chartex" xmlns:cx7="http://schemas.microsoft.com/office/drawing/2016/5/13/chartex" xmlns:cx8="http://schemas.microsoft.com/office/drawing/2016/5/14/chartex" xmlns:mc="http://schemas.openxmlformats.org/markup-compatibility/2006" xmlns:aink="http://schemas.microsoft.com/office/drawing/2016/ink" xmlns:am3d="http://schemas.microsoft.com/office/drawing/2017/model3d" xmlns:o="urn:schemas-microsoft-com:office:office" xmlns:r="http://schemas.openxmlformats.org/officeDocument/2006/relationships" xmlns:m="http://schemas.openxmlformats.org/officeDocument/2006/math" xmlns:v="urn:schemas-microsoft-com:vml" xmlns:wp14="http://schemas.microsoft.com/office/word/2010/wordprocessingDrawing" xmlns:wp="http://schemas.openxmlformats.org/drawingml/2006/wordprocessingDrawing" xmlns:w10="urn:schemas-microsoft-com:office:word" xmlns:w="http://schemas.openxmlformats.org/wordprocessingml/2006/main" xmlns:w14="http://schemas.microsoft.com/office/word/2010/wordml" xmlns:w15="http://schemas.microsoft.com/office/word/2012/wordml" xmlns:w16cex="http://schemas.microsoft.com/office/word/2018/wordml/cex" xmlns:w16cid="http://schemas.microsoft.com/office/word/2016/wordml/cid" xmlns:w16="http://schemas.microsoft.com/office/word/2018/wordml" xmlns:w16sdtdh="http://schemas.microsoft.com/office/word/2020/wordml/sdtdatahash" xmlns:w16se="http://schemas.microsoft.com/office/word/2015/wordml/symex" xmlns:wpg="http://schemas.microsoft.com/office/word/2010/wordprocessingGroup" xmlns:wpi="http://schemas.microsoft.com/office/word/2010/wordprocessingInk" xmlns:wne="http://schemas.microsoft.com/office/word/2006/wordml" xmlns:wps="http://schemas.microsoft.com/office/word/2010/wordprocessingShape"/>
 </file>
 
 <file path=word/endnotes.xml><?xml version="1.0" encoding="utf-8"?>
@@ -56187,7 +56183,7 @@
 <w:numbering xmlns:wpc="http://schemas.microsoft.com/office/word/2010/wordprocessingCanvas" xmlns:mc="http://schemas.openxmlformats.org/markup-compatibility/2006" xmlns:o="urn:schemas-microsoft-com:office:office" xmlns:r="http://schemas.openxmlformats.org/officeDocument/2006/relationships" xmlns:m="http://schemas.openxmlformats.org/officeDocument/2006/math" xmlns:v="urn:schemas-microsoft-com:vml" xmlns:wp14="http://schemas.microsoft.com/office/word/2010/wordprocessingDrawing" xmlns:wp="http://schemas.openxmlformats.org/drawingml/2006/wordprocessingDrawing" xmlns:w10="urn:schemas-microsoft-com:office:word" xmlns:w="http://schemas.openxmlformats.org/wordprocessingml/2006/main" xmlns:w14="http://schemas.microsoft.com/office/word/2010/wordml" xmlns:w15="http://schemas.microsoft.com/office/word/2012/wordml" xmlns:wpg="http://schemas.microsoft.com/office/word/2010/wordprocessingGroup" xmlns:wpi="http://schemas.microsoft.com/office/word/2010/wordprocessingInk" xmlns:wne="http://schemas.microsoft.com/office/word/2006/wordml" xmlns:wps="http://schemas.microsoft.com/office/word/2010/wordprocessingShape" mc:Ignorable="w14 w15 wp14">
   <w:abstractNum w:abstractNumId="1" w15:restartNumberingAfterBreak="0">
     <w:multiLevelType w:val="hybridMultilevel"/>
-    <w:lvl w:ilvl="0" w15:tentative="1">
+    <w:lvl w:ilvl="0" w:tentative="1">
       <w:start w:val="1"/>
       <w:numFmt w:val="bullet"/>
       <w:lvlText w:val="●"/>
@@ -56196,7 +56192,7 @@
         <w:ind w:left="720" w:hanging="360"/>
       </w:pPr>
     </w:lvl>
-    <w:lvl w:ilvl="1" w15:tentative="1">
+    <w:lvl w:ilvl="1" w:tentative="1">
       <w:start w:val="1"/>
       <w:numFmt w:val="bullet"/>
       <w:lvlText w:val="○"/>
@@ -56205,7 +56201,7 @@
         <w:ind w:left="1440" w:hanging="360"/>
       </w:pPr>
     </w:lvl>
-    <w:lvl w:ilvl="2" w15:tentative="1">
+    <w:lvl w:ilvl="2" w:tentative="1">
       <w:start w:val="1"/>
       <w:numFmt w:val="bullet"/>
       <w:lvlText w:val="■"/>
@@ -56214,7 +56210,7 @@
         <w:ind w:left="2160" w:hanging="360"/>
       </w:pPr>
     </w:lvl>
-    <w:lvl w:ilvl="3" w15:tentative="1">
+    <w:lvl w:ilvl="3" w:tentative="1">
       <w:start w:val="1"/>
       <w:numFmt w:val="bullet"/>
       <w:lvlText w:val="●"/>
@@ -56223,7 +56219,7 @@
         <w:ind w:left="2880" w:hanging="360"/>
       </w:pPr>
     </w:lvl>
-    <w:lvl w:ilvl="4" w15:tentative="1">
+    <w:lvl w:ilvl="4" w:tentative="1">
       <w:start w:val="1"/>
       <w:numFmt w:val="bullet"/>
       <w:lvlText w:val="○"/>
@@ -56232,7 +56228,7 @@
         <w:ind w:left="3600" w:hanging="360"/>
       </w:pPr>
     </w:lvl>
-    <w:lvl w:ilvl="5" w15:tentative="1">
+    <w:lvl w:ilvl="5" w:tentative="1">
       <w:start w:val="1"/>
       <w:numFmt w:val="bullet"/>
       <w:lvlText w:val="■"/>
@@ -56241,7 +56237,7 @@
         <w:ind w:left="4320" w:hanging="360"/>
       </w:pPr>
     </w:lvl>
-    <w:lvl w:ilvl="6" w15:tentative="1">
+    <w:lvl w:ilvl="6" w:tentative="1">
       <w:start w:val="1"/>
       <w:numFmt w:val="bullet"/>
       <w:lvlText w:val="●"/>
@@ -56250,7 +56246,7 @@
         <w:ind w:left="5040" w:hanging="360"/>
       </w:pPr>
     </w:lvl>
-    <w:lvl w:ilvl="7" w15:tentative="1">
+    <w:lvl w:ilvl="7" w:tentative="1">
       <w:start w:val="1"/>
       <w:numFmt w:val="bullet"/>
       <w:lvlText w:val="●"/>
@@ -56259,7 +56255,7 @@
         <w:ind w:left="5760" w:hanging="360"/>
       </w:pPr>
     </w:lvl>
-    <w:lvl w:ilvl="8" w15:tentative="1">
+    <w:lvl w:ilvl="8" w:tentative="1">
       <w:start w:val="1"/>
       <w:numFmt w:val="bullet"/>
       <w:lvlText w:val="●"/>
@@ -56271,7 +56267,7 @@
   </w:abstractNum>
   <w:abstractNum w:abstractNumId="2" w15:restartNumberingAfterBreak="0">
     <w:multiLevelType w:val="hybridMultilevel"/>
-    <w:lvl w:ilvl="0" w15:tentative="1">
+    <w:lvl w:ilvl="0" w:tentative="1">
       <w:start w:val="1"/>
       <w:numFmt w:val="bullet"/>
       <w:lvlText w:val="•"/>
@@ -56280,7 +56276,7 @@
         <w:ind w:left="540" w:hanging="270"/>
       </w:pPr>
     </w:lvl>
-    <w:lvl w:ilvl="1" w15:tentative="1">
+    <w:lvl w:ilvl="1" w:tentative="1">
       <w:start w:val="1"/>
       <w:numFmt w:val="bullet"/>
       <w:lvlText w:val="–"/>
@@ -56292,7 +56288,7 @@
   </w:abstractNum>
   <w:abstractNum w:abstractNumId="3" w15:restartNumberingAfterBreak="0">
     <w:multiLevelType w:val="hybridMultilevel"/>
-    <w:lvl w:ilvl="0" w15:tentative="1">
+    <w:lvl w:ilvl="0" w:tentative="1">
       <w:start w:val="1"/>
       <w:numFmt w:val="decimal"/>
       <w:lvlText w:val="%1."/>
@@ -56335,6 +56331,10 @@
     </w:rPrDefault>
     <w:pPrDefault/>
   </w:docDefaults>
+  <w:style w:type="paragraph" w:styleId="Normal" w:default="1">
+    <w:name w:val="Normal"/>
+    <w:qFormat/>
+  </w:style>
   <w:style w:type="paragraph" w:styleId="Title">
     <w:name w:val="Title"/>
     <w:basedOn w:val="Normal"/>
@@ -56343,39 +56343,6 @@
     <w:rPr>
       <w:sz w:val="56"/>
       <w:szCs w:val="56"/>
-    </w:rPr>
-  </w:style>
-  <w:style w:type="paragraph" w:styleId="Heading1">
-    <w:name w:val="Heading 1"/>
-    <w:basedOn w:val="Normal"/>
-    <w:next w:val="Normal"/>
-    <w:qFormat/>
-    <w:rPr>
-      <w:color w:val="2E74B5"/>
-      <w:sz w:val="32"/>
-      <w:szCs w:val="32"/>
-    </w:rPr>
-  </w:style>
-  <w:style w:type="paragraph" w:styleId="Heading2">
-    <w:name w:val="Heading 2"/>
-    <w:basedOn w:val="Normal"/>
-    <w:next w:val="Normal"/>
-    <w:qFormat/>
-    <w:rPr>
-      <w:color w:val="2E74B5"/>
-      <w:sz w:val="26"/>
-      <w:szCs w:val="26"/>
-    </w:rPr>
-  </w:style>
-  <w:style w:type="paragraph" w:styleId="Heading3">
-    <w:name w:val="Heading 3"/>
-    <w:basedOn w:val="Normal"/>
-    <w:next w:val="Normal"/>
-    <w:qFormat/>
-    <w:rPr>
-      <w:color w:val="1F4D78"/>
-      <w:sz w:val="24"/>
-      <w:szCs w:val="24"/>
     </w:rPr>
   </w:style>
   <w:style w:type="paragraph" w:styleId="Heading4">
@@ -56561,4 +56528,294 @@
     </w:rPr>
   </w:style>
 </w:styles>
+</file>
+
+<file path=word/theme/theme1.xml><?xml version="1.0" encoding="utf-8"?>
+<a:theme xmlns:a="http://schemas.openxmlformats.org/drawingml/2006/main" name="Office Theme">
+  <a:themeElements>
+    <a:clrScheme name="Office">
+      <a:dk1>
+        <a:sysClr val="windowText" lastClr="000000"/>
+      </a:dk1>
+      <a:lt1>
+        <a:sysClr val="window" lastClr="FFFFFF"/>
+      </a:lt1>
+      <a:dk2>
+        <a:srgbClr val="44546A"/>
+      </a:dk2>
+      <a:lt2>
+        <a:srgbClr val="E7E6E6"/>
+      </a:lt2>
+      <a:accent1>
+        <a:srgbClr val="4472C4"/>
+      </a:accent1>
+      <a:accent2>
+        <a:srgbClr val="ED7D31"/>
+      </a:accent2>
+      <a:accent3>
+        <a:srgbClr val="A5A5A5"/>
+      </a:accent3>
+      <a:accent4>
+        <a:srgbClr val="FFC000"/>
+      </a:accent4>
+      <a:accent5>
+        <a:srgbClr val="5B9BD5"/>
+      </a:accent5>
+      <a:accent6>
+        <a:srgbClr val="70AD47"/>
+      </a:accent6>
+      <a:hlink>
+        <a:srgbClr val="0563C1"/>
+      </a:hlink>
+      <a:folHlink>
+        <a:srgbClr val="954F72"/>
+      </a:folHlink>
+    </a:clrScheme>
+    <a:fontScheme name="Office">
+      <a:majorFont>
+        <a:latin typeface="Calibri Light" panose="020F0302020204030204"/>
+        <a:ea typeface=""/>
+        <a:cs typeface=""/>
+        <a:font script="Jpan" typeface="游ゴシック Light"/>
+        <a:font script="Hang" typeface="맑은 고딕"/>
+        <a:font script="Hans" typeface="等线 Light"/>
+        <a:font script="Hant" typeface="新細明體"/>
+        <a:font script="Arab" typeface="Times New Roman"/>
+        <a:font script="Hebr" typeface="Times New Roman"/>
+        <a:font script="Thai" typeface="Angsana New"/>
+        <a:font script="Ethi" typeface="Nyala"/>
+        <a:font script="Beng" typeface="Vrinda"/>
+        <a:font script="Gujr" typeface="Shruti"/>
+        <a:font script="Khmr" typeface="MoolBoran"/>
+        <a:font script="Knda" typeface="Tunga"/>
+        <a:font script="Guru" typeface="Raavi"/>
+        <a:font script="Cans" typeface="Euphemia"/>
+        <a:font script="Cher" typeface="Plantagenet Cherokee"/>
+        <a:font script="Yiii" typeface="Microsoft Yi Baiti"/>
+        <a:font script="Tibt" typeface="Microsoft Himalaya"/>
+        <a:font script="Thaa" typeface="MV Boli"/>
+        <a:font script="Deva" typeface="Mangal"/>
+        <a:font script="Telu" typeface="Gautami"/>
+        <a:font script="Taml" typeface="Latha"/>
+        <a:font script="Syrc" typeface="Estrangelo Edessa"/>
+        <a:font script="Orya" typeface="Kalinga"/>
+        <a:font script="Mlym" typeface="Kartika"/>
+        <a:font script="Laoo" typeface="DokChampa"/>
+        <a:font script="Sinh" typeface="Iskoola Pota"/>
+        <a:font script="Mong" typeface="Mongolian Baiti"/>
+        <a:font script="Viet" typeface="Times New Roman"/>
+        <a:font script="Uigh" typeface="Microsoft Uighur"/>
+        <a:font script="Geor" typeface="Sylfaen"/>
+        <a:font script="Armn" typeface="Arial"/>
+        <a:font script="Bugi" typeface="Leelawadee UI"/>
+        <a:font script="Bopo" typeface="Microsoft JhengHei"/>
+        <a:font script="Java" typeface="Javanese Text"/>
+        <a:font script="Lisu" typeface="Segoe UI"/>
+        <a:font script="Mymr" typeface="Myanmar Text"/>
+        <a:font script="Nkoo" typeface="Ebrima"/>
+        <a:font script="Olck" typeface="Nirmala UI"/>
+        <a:font script="Osma" typeface="Ebrima"/>
+        <a:font script="Phag" typeface="Phagspa"/>
+        <a:font script="Syrn" typeface="Estrangelo Edessa"/>
+        <a:font script="Syrj" typeface="Estrangelo Edessa"/>
+        <a:font script="Syre" typeface="Estrangelo Edessa"/>
+        <a:font script="Sora" typeface="Nirmala UI"/>
+        <a:font script="Tale" typeface="Microsoft Tai Le"/>
+        <a:font script="Talu" typeface="Microsoft New Tai Lue"/>
+        <a:font script="Tfng" typeface="Ebrima"/>
+      </a:majorFont>
+      <a:minorFont>
+        <a:latin typeface="Calibri" panose="020F0502020204030204"/>
+        <a:ea typeface=""/>
+        <a:cs typeface=""/>
+        <a:font script="Jpan" typeface="游明朝"/>
+        <a:font script="Hang" typeface="맑은 고딕"/>
+        <a:font script="Hans" typeface="等线"/>
+        <a:font script="Hant" typeface="新細明體"/>
+        <a:font script="Arab" typeface="Arial"/>
+        <a:font script="Hebr" typeface="Arial"/>
+        <a:font script="Thai" typeface="Cordia New"/>
+        <a:font script="Ethi" typeface="Nyala"/>
+        <a:font script="Beng" typeface="Vrinda"/>
+        <a:font script="Gujr" typeface="Shruti"/>
+        <a:font script="Khmr" typeface="DaunPenh"/>
+        <a:font script="Knda" typeface="Tunga"/>
+        <a:font script="Guru" typeface="Raavi"/>
+        <a:font script="Cans" typeface="Euphemia"/>
+        <a:font script="Cher" typeface="Plantagenet Cherokee"/>
+        <a:font script="Yiii" typeface="Microsoft Yi Baiti"/>
+        <a:font script="Tibt" typeface="Microsoft Himalaya"/>
+        <a:font script="Thaa" typeface="MV Boli"/>
+        <a:font script="Deva" typeface="Mangal"/>
+        <a:font script="Telu" typeface="Gautami"/>
+        <a:font script="Taml" typeface="Latha"/>
+        <a:font script="Syrc" typeface="Estrangelo Edessa"/>
+        <a:font script="Orya" typeface="Kalinga"/>
+        <a:font script="Mlym" typeface="Kartika"/>
+        <a:font script="Laoo" typeface="DokChampa"/>
+        <a:font script="Sinh" typeface="Iskoola Pota"/>
+        <a:font script="Mong" typeface="Mongolian Baiti"/>
+        <a:font script="Viet" typeface="Arial"/>
+        <a:font script="Uigh" typeface="Microsoft Uighur"/>
+        <a:font script="Geor" typeface="Sylfaen"/>
+        <a:font script="Armn" typeface="Arial"/>
+        <a:font script="Bugi" typeface="Leelawadee UI"/>
+        <a:font script="Bopo" typeface="Microsoft JhengHei"/>
+        <a:font script="Java" typeface="Javanese Text"/>
+        <a:font script="Lisu" typeface="Segoe UI"/>
+        <a:font script="Mymr" typeface="Myanmar Text"/>
+        <a:font script="Nkoo" typeface="Ebrima"/>
+        <a:font script="Olck" typeface="Nirmala UI"/>
+        <a:font script="Osma" typeface="Ebrima"/>
+        <a:font script="Phag" typeface="Phagspa"/>
+        <a:font script="Syrn" typeface="Estrangelo Edessa"/>
+        <a:font script="Syrj" typeface="Estrangelo Edessa"/>
+        <a:font script="Syre" typeface="Estrangelo Edessa"/>
+        <a:font script="Sora" typeface="Nirmala UI"/>
+        <a:font script="Tale" typeface="Microsoft Tai Le"/>
+        <a:font script="Talu" typeface="Microsoft New Tai Lue"/>
+        <a:font script="Tfng" typeface="Ebrima"/>
+      </a:minorFont>
+    </a:fontScheme>
+    <a:fmtScheme name="Office">
+      <a:fillStyleLst>
+        <a:solidFill>
+          <a:schemeClr val="phClr"/>
+        </a:solidFill>
+        <a:gradFill rotWithShape="true">
+          <a:gsLst>
+            <a:gs pos="0">
+              <a:schemeClr val="phClr">
+                <a:lumMod val="110000"/>
+                <a:satMod val="105000"/>
+                <a:tint val="67000"/>
+              </a:schemeClr>
+            </a:gs>
+            <a:gs pos="50000">
+              <a:schemeClr val="phClr">
+                <a:lumMod val="105000"/>
+                <a:satMod val="103000"/>
+                <a:tint val="73000"/>
+              </a:schemeClr>
+            </a:gs>
+            <a:gs pos="100000">
+              <a:schemeClr val="phClr">
+                <a:lumMod val="105000"/>
+                <a:satMod val="109000"/>
+                <a:tint val="81000"/>
+              </a:schemeClr>
+            </a:gs>
+          </a:gsLst>
+          <a:lin ang="5400000" scaled="false"/>
+        </a:gradFill>
+        <a:gradFill rotWithShape="true">
+          <a:gsLst>
+            <a:gs pos="0">
+              <a:schemeClr val="phClr">
+                <a:satMod val="103000"/>
+                <a:lumMod val="102000"/>
+                <a:tint val="94000"/>
+              </a:schemeClr>
+            </a:gs>
+            <a:gs pos="50000">
+              <a:schemeClr val="phClr">
+                <a:satMod val="110000"/>
+                <a:lumMod val="100000"/>
+                <a:shade val="100000"/>
+              </a:schemeClr>
+            </a:gs>
+            <a:gs pos="100000">
+              <a:schemeClr val="phClr">
+                <a:lumMod val="99000"/>
+                <a:satMod val="120000"/>
+                <a:shade val="78000"/>
+              </a:schemeClr>
+            </a:gs>
+          </a:gsLst>
+          <a:lin ang="5400000" scaled="false"/>
+        </a:gradFill>
+      </a:fillStyleLst>
+      <a:lnStyleLst>
+        <a:ln w="6350" cap="flat" cmpd="sng" algn="ctr">
+          <a:solidFill>
+            <a:schemeClr val="phClr"/>
+          </a:solidFill>
+          <a:prstDash val="solid"/>
+          <a:miter lim="800000"/>
+        </a:ln>
+        <a:ln w="12700" cap="flat" cmpd="sng" algn="ctr">
+          <a:solidFill>
+            <a:schemeClr val="phClr"/>
+          </a:solidFill>
+          <a:prstDash val="solid"/>
+          <a:miter lim="800000"/>
+        </a:ln>
+        <a:ln w="19050" cap="flat" cmpd="sng" algn="ctr">
+          <a:solidFill>
+            <a:schemeClr val="phClr"/>
+          </a:solidFill>
+          <a:prstDash val="solid"/>
+          <a:miter lim="800000"/>
+        </a:ln>
+      </a:lnStyleLst>
+      <a:effectStyleLst>
+        <a:effectStyle>
+          <a:effectLst/>
+        </a:effectStyle>
+        <a:effectStyle>
+          <a:effectLst/>
+        </a:effectStyle>
+        <a:effectStyle>
+          <a:effectLst>
+            <a:outerShdw blurRad="57150" dist="19050" dir="5400000" algn="ctr" rotWithShape="false">
+              <a:srgbClr val="000000">
+                <a:alpha val="63000"/>
+              </a:srgbClr>
+            </a:outerShdw>
+          </a:effectLst>
+        </a:effectStyle>
+      </a:effectStyleLst>
+      <a:bgFillStyleLst>
+        <a:solidFill>
+          <a:schemeClr val="phClr"/>
+        </a:solidFill>
+        <a:solidFill>
+          <a:schemeClr val="phClr">
+            <a:tint val="95000"/>
+            <a:satMod val="170000"/>
+          </a:schemeClr>
+        </a:solidFill>
+        <a:gradFill rotWithShape="true">
+          <a:gsLst>
+            <a:gs pos="0">
+              <a:schemeClr val="phClr">
+                <a:tint val="93000"/>
+                <a:satMod val="150000"/>
+                <a:shade val="98000"/>
+                <a:lumMod val="102000"/>
+              </a:schemeClr>
+            </a:gs>
+            <a:gs pos="50000">
+              <a:schemeClr val="phClr">
+                <a:tint val="98000"/>
+                <a:satMod val="130000"/>
+                <a:shade val="90000"/>
+                <a:lumMod val="103000"/>
+              </a:schemeClr>
+            </a:gs>
+            <a:gs pos="100000">
+              <a:schemeClr val="phClr">
+                <a:shade val="63000"/>
+                <a:satMod val="120000"/>
+              </a:schemeClr>
+            </a:gs>
+          </a:gsLst>
+          <a:lin ang="5400000" scaled="false"/>
+        </a:gradFill>
+      </a:bgFillStyleLst>
+    </a:fmtScheme>
+  </a:themeElements>
+  <a:objectDefaults/>
+  <a:extraClrSchemeLst/>
+</a:theme>
 </file>
</xml_diff>